<commit_message>
Update app cu api anaf, creare installer v5
</commit_message>
<xml_diff>
--- a/pyinstaller command ok.docx
+++ b/pyinstaller command ok.docx
@@ -3,176 +3,63 @@
 <w:document xmlns:wpc="http://schemas.microsoft.com/office/word/2010/wordprocessingCanvas" xmlns:cx="http://schemas.microsoft.com/office/drawing/2014/chartex" xmlns:cx1="http://schemas.microsoft.com/office/drawing/2015/9/8/chartex" xmlns:cx2="http://schemas.microsoft.com/office/drawing/2015/10/21/chartex" xmlns:cx3="http://schemas.microsoft.com/office/drawing/2016/5/9/chartex" xmlns:cx4="http://schemas.microsoft.com/office/drawing/2016/5/10/chartex" xmlns:cx5="http://schemas.microsoft.com/office/drawing/2016/5/11/chartex" xmlns:cx6="http://schemas.microsoft.com/office/drawing/2016/5/12/chartex" xmlns:cx7="http://schemas.microsoft.com/office/drawing/2016/5/13/chartex" xmlns:cx8="http://schemas.microsoft.com/office/drawing/2016/5/14/chartex" xmlns:mc="http://schemas.openxmlformats.org/markup-compatibility/2006" xmlns:aink="http://schemas.microsoft.com/office/drawing/2016/ink" xmlns:am3d="http://schemas.microsoft.com/office/drawing/2017/model3d" xmlns:o="urn:schemas-microsoft-com:office:office" xmlns:oel="http://schemas.microsoft.com/office/2019/extlst" xmlns:r="http://schemas.openxmlformats.org/officeDocument/2006/relationships" xmlns:m="http://schemas.openxmlformats.org/officeDocument/2006/math" xmlns:v="urn:schemas-microsoft-com:vml" xmlns:wp14="http://schemas.microsoft.com/office/word/2010/wordprocessingDrawing" xmlns:wp="http://schemas.openxmlformats.org/drawingml/2006/wordprocessingDrawing" xmlns:w10="urn:schemas-microsoft-com:office:word" xmlns:w="http://schemas.openxmlformats.org/wordprocessingml/2006/main" xmlns:w14="http://schemas.microsoft.com/office/word/2010/wordml" xmlns:w15="http://schemas.microsoft.com/office/word/2012/wordml" xmlns:w16cex="http://schemas.microsoft.com/office/word/2018/wordml/cex" xmlns:w16cid="http://schemas.microsoft.com/office/word/2016/wordml/cid" xmlns:w16="http://schemas.microsoft.com/office/word/2018/wordml" xmlns:w16du="http://schemas.microsoft.com/office/word/2023/wordml/word16du" xmlns:w16sdtdh="http://schemas.microsoft.com/office/word/2020/wordml/sdtdatahash" xmlns:w16sdtfl="http://schemas.microsoft.com/office/word/2024/wordml/sdtformatlock" xmlns:w16se="http://schemas.microsoft.com/office/word/2015/wordml/symex" xmlns:wpg="http://schemas.microsoft.com/office/word/2010/wordprocessingGroup" xmlns:wpi="http://schemas.microsoft.com/office/word/2010/wordprocessingInk" xmlns:wne="http://schemas.microsoft.com/office/word/2006/wordml" xmlns:wps="http://schemas.microsoft.com/office/word/2010/wordprocessingShape" mc:Ignorable="w14 w15 w16se w16cid w16 w16cex w16sdtdh w16sdtfl w16du wp14">
   <w:body>
     <w:p>
-      <w:proofErr w:type="spellStart"/>
-      <w:r>
-        <w:t>pyinstaller</w:t>
-      </w:r>
-      <w:proofErr w:type="spellEnd"/>
-      <w:r>
-        <w:t xml:space="preserve"> `</w:t>
-      </w:r>
-    </w:p>
-    <w:p>
-      <w:r>
-        <w:t>--</w:t>
-      </w:r>
-      <w:proofErr w:type="spellStart"/>
-      <w:r>
-        <w:t>onedir</w:t>
-      </w:r>
-      <w:proofErr w:type="spellEnd"/>
-      <w:r>
-        <w:t xml:space="preserve"> `</w:t>
-      </w:r>
-    </w:p>
-    <w:p>
-      <w:r>
-        <w:t>--</w:t>
-      </w:r>
-      <w:proofErr w:type="spellStart"/>
-      <w:r>
-        <w:t>noconsole</w:t>
-      </w:r>
-      <w:proofErr w:type="spellEnd"/>
-      <w:r>
-        <w:t xml:space="preserve"> `</w:t>
-      </w:r>
-    </w:p>
-    <w:p>
-      <w:r>
-        <w:t>--add-data "</w:t>
-      </w:r>
-      <w:proofErr w:type="spellStart"/>
-      <w:r>
-        <w:t>baza_</w:t>
-      </w:r>
-      <w:proofErr w:type="gramStart"/>
-      <w:r>
-        <w:t>date.db</w:t>
-      </w:r>
-      <w:proofErr w:type="spellEnd"/>
-      <w:r>
-        <w:t>;.</w:t>
-      </w:r>
-      <w:proofErr w:type="gramEnd"/>
-      <w:r>
-        <w:t>" `</w:t>
-      </w:r>
-    </w:p>
-    <w:p>
-      <w:r>
-        <w:t>--add-data "</w:t>
-      </w:r>
-      <w:proofErr w:type="gramStart"/>
-      <w:r>
-        <w:t>mapping_tehnician.xlsx;.</w:t>
-      </w:r>
-      <w:proofErr w:type="gramEnd"/>
-      <w:r>
-        <w:t>" `</w:t>
-      </w:r>
-    </w:p>
-    <w:p>
-      <w:r>
-        <w:t>--add-data "</w:t>
-      </w:r>
-      <w:proofErr w:type="gramStart"/>
-      <w:r>
-        <w:t>mapping_model_amef.xlsx;.</w:t>
-      </w:r>
-      <w:proofErr w:type="gramEnd"/>
-      <w:r>
-        <w:t>" `</w:t>
-      </w:r>
-    </w:p>
-    <w:p>
-      <w:r>
-        <w:t>--add-data "</w:t>
-      </w:r>
-      <w:proofErr w:type="spellStart"/>
-      <w:proofErr w:type="gramStart"/>
-      <w:r>
-        <w:t>template;template</w:t>
-      </w:r>
-      <w:proofErr w:type="spellEnd"/>
-      <w:proofErr w:type="gramEnd"/>
-      <w:r>
-        <w:t>" `</w:t>
-      </w:r>
-    </w:p>
-    <w:p>
-      <w:r>
-        <w:t>--add-data "</w:t>
-      </w:r>
-      <w:proofErr w:type="spellStart"/>
-      <w:proofErr w:type="gramStart"/>
-      <w:r>
-        <w:t>semnaturi</w:t>
-      </w:r>
-      <w:r>
-        <w:t>;</w:t>
-      </w:r>
-      <w:r>
-        <w:t>semnaturi</w:t>
-      </w:r>
-      <w:proofErr w:type="spellEnd"/>
-      <w:proofErr w:type="gramEnd"/>
-      <w:r>
-        <w:t>" `</w:t>
-      </w:r>
-    </w:p>
-    <w:p>
-      <w:r>
-        <w:t>--add-data "</w:t>
-      </w:r>
-      <w:proofErr w:type="spellStart"/>
-      <w:proofErr w:type="gramStart"/>
-      <w:r>
-        <w:t>icons;icons</w:t>
-      </w:r>
-      <w:proofErr w:type="spellEnd"/>
-      <w:proofErr w:type="gramEnd"/>
-      <w:r>
-        <w:t>" `</w:t>
-      </w:r>
-    </w:p>
-    <w:p>
-      <w:r>
-        <w:t>--hidden-import=</w:t>
-      </w:r>
-      <w:proofErr w:type="spellStart"/>
-      <w:r>
-        <w:t>tkcalendar</w:t>
-      </w:r>
-      <w:proofErr w:type="spellEnd"/>
-      <w:r>
-        <w:t xml:space="preserve"> `</w:t>
-      </w:r>
-    </w:p>
-    <w:p>
-      <w:r>
-        <w:t>--hidden-import=</w:t>
-      </w:r>
-      <w:proofErr w:type="spellStart"/>
-      <w:r>
-        <w:t>python_dotenv</w:t>
-      </w:r>
-      <w:proofErr w:type="spellEnd"/>
-      <w:r>
-        <w:t xml:space="preserve"> `</w:t>
-      </w:r>
-    </w:p>
-    <w:p>
-      <w:r>
-        <w:t>--hidden-import=</w:t>
-      </w:r>
-      <w:proofErr w:type="spellStart"/>
-      <w:r>
-        <w:t>dateutil</w:t>
-      </w:r>
-      <w:proofErr w:type="spellEnd"/>
-      <w:r>
-        <w:t xml:space="preserve"> `</w:t>
+      <w:r>
+        <w:t>pyinstaller `</w:t>
+      </w:r>
+    </w:p>
+    <w:p>
+      <w:r>
+        <w:t>--onedir `</w:t>
+      </w:r>
+    </w:p>
+    <w:p>
+      <w:r>
+        <w:t>--noconsole `</w:t>
+      </w:r>
+    </w:p>
+    <w:p>
+      <w:r>
+        <w:t>--add-data "baza_date.db;." `</w:t>
+      </w:r>
+    </w:p>
+    <w:p>
+      <w:r>
+        <w:t>--add-data "mapping_tehnician.xlsx;." `</w:t>
+      </w:r>
+    </w:p>
+    <w:p>
+      <w:r>
+        <w:t>--add-data "mapping_model_amef.xlsx;." `</w:t>
+      </w:r>
+    </w:p>
+    <w:p>
+      <w:r>
+        <w:t>--add-data "template;template" `</w:t>
+      </w:r>
+    </w:p>
+    <w:p>
+      <w:r>
+        <w:t>--add-data "semnaturi;semnaturi" `</w:t>
+      </w:r>
+    </w:p>
+    <w:p>
+      <w:r>
+        <w:t>--add-data "icons;icons" `</w:t>
+      </w:r>
+    </w:p>
+    <w:p>
+      <w:r>
+        <w:t>--hidden-import=tkcalendar `</w:t>
+      </w:r>
+    </w:p>
+    <w:p>
+      <w:r>
+        <w:t>--hidden-import=python_dotenv `</w:t>
+      </w:r>
+    </w:p>
+    <w:p>
+      <w:r>
+        <w:t>--hidden-import=dateutil `</w:t>
       </w:r>
     </w:p>
     <w:p>
@@ -182,28 +69,12 @@
     </w:p>
     <w:p>
       <w:r>
-        <w:t>--hidden-import=</w:t>
-      </w:r>
-      <w:proofErr w:type="spellStart"/>
-      <w:r>
-        <w:t>reportlab</w:t>
-      </w:r>
-      <w:proofErr w:type="spellEnd"/>
-      <w:r>
-        <w:t xml:space="preserve"> `</w:t>
-      </w:r>
-    </w:p>
-    <w:p>
-      <w:r>
-        <w:t>--hidden-import=</w:t>
-      </w:r>
-      <w:proofErr w:type="spellStart"/>
-      <w:r>
-        <w:t>pypdf</w:t>
-      </w:r>
-      <w:proofErr w:type="spellEnd"/>
-      <w:r>
-        <w:t xml:space="preserve"> `</w:t>
+        <w:t>--hidden-import=reportlab `</w:t>
+      </w:r>
+    </w:p>
+    <w:p>
+      <w:r>
+        <w:t>--hidden-import=pypdf `</w:t>
       </w:r>
     </w:p>
     <w:p>
@@ -213,28 +84,12 @@
     </w:p>
     <w:p>
       <w:r>
-        <w:t>--hidden-import=</w:t>
-      </w:r>
-      <w:proofErr w:type="spellStart"/>
-      <w:r>
-        <w:t>docxtpl</w:t>
-      </w:r>
-      <w:proofErr w:type="spellEnd"/>
-      <w:r>
-        <w:t xml:space="preserve"> `</w:t>
-      </w:r>
-    </w:p>
-    <w:p>
-      <w:r>
-        <w:t>--hidden-import=</w:t>
-      </w:r>
-      <w:proofErr w:type="spellStart"/>
-      <w:r>
-        <w:t>openpyxl</w:t>
-      </w:r>
-      <w:proofErr w:type="spellEnd"/>
-      <w:r>
-        <w:t xml:space="preserve"> `</w:t>
+        <w:t>--hidden-import=docxtpl `</w:t>
+      </w:r>
+    </w:p>
+    <w:p>
+      <w:r>
+        <w:t>--hidden-import=openpyxl `</w:t>
       </w:r>
     </w:p>
     <w:p>
@@ -244,28 +99,12 @@
     </w:p>
     <w:p>
       <w:r>
-        <w:t>--hidden-import=</w:t>
-      </w:r>
-      <w:proofErr w:type="spellStart"/>
-      <w:r>
-        <w:t>xlrd</w:t>
-      </w:r>
-      <w:proofErr w:type="spellEnd"/>
-      <w:r>
-        <w:t xml:space="preserve"> `</w:t>
-      </w:r>
-    </w:p>
-    <w:p>
-      <w:r>
-        <w:t>--hidden-import=</w:t>
-      </w:r>
-      <w:proofErr w:type="spellStart"/>
-      <w:r>
-        <w:t>pytz</w:t>
-      </w:r>
-      <w:proofErr w:type="spellEnd"/>
-      <w:r>
-        <w:t xml:space="preserve"> `</w:t>
+        <w:t>--hidden-import=xlrd `</w:t>
+      </w:r>
+    </w:p>
+    <w:p>
+      <w:r>
+        <w:t>--hidden-import=pytz `</w:t>
       </w:r>
     </w:p>
     <w:p>
@@ -275,47 +114,17 @@
     </w:p>
     <w:p>
       <w:r>
-        <w:t>--hidden-import=</w:t>
-      </w:r>
-      <w:proofErr w:type="spellStart"/>
-      <w:proofErr w:type="gramStart"/>
-      <w:r>
-        <w:t>babel.numbers</w:t>
-      </w:r>
-      <w:proofErr w:type="spellEnd"/>
-      <w:proofErr w:type="gramEnd"/>
-      <w:r>
-        <w:t xml:space="preserve"> `</w:t>
-      </w:r>
-    </w:p>
-    <w:p>
-      <w:r>
-        <w:t>--hidden-import=</w:t>
-      </w:r>
-      <w:proofErr w:type="spellStart"/>
-      <w:proofErr w:type="gramStart"/>
-      <w:r>
-        <w:t>babel.localedata</w:t>
-      </w:r>
-      <w:proofErr w:type="spellEnd"/>
-      <w:proofErr w:type="gramEnd"/>
-      <w:r>
-        <w:t xml:space="preserve"> `</w:t>
-      </w:r>
-    </w:p>
-    <w:p>
-      <w:r>
-        <w:t>--hidden-import=</w:t>
-      </w:r>
-      <w:proofErr w:type="spellStart"/>
-      <w:proofErr w:type="gramStart"/>
-      <w:r>
-        <w:t>babel.dates</w:t>
-      </w:r>
-      <w:proofErr w:type="spellEnd"/>
-      <w:proofErr w:type="gramEnd"/>
-      <w:r>
-        <w:t xml:space="preserve"> `</w:t>
+        <w:t>--hidden-import=babel.numbers `</w:t>
+      </w:r>
+    </w:p>
+    <w:p>
+      <w:r>
+        <w:t>--hidden-import=babel.localedata `</w:t>
+      </w:r>
+    </w:p>
+    <w:p>
+      <w:r>
+        <w:t>--hidden-import=babel.dates `</w:t>
       </w:r>
     </w:p>
     <w:p>
@@ -346,7 +155,13 @@
     </w:p>
     <w:p>
       <w:r>
-        <w:t>--name Gestiune_clienti_sqlite_portabil_v3 gestiune_clienti_sqlite.py</w:t>
+        <w:t>--name Gestiune_clienti_sqlite_portabil_v</w:t>
+      </w:r>
+      <w:r>
+        <w:t>5</w:t>
+      </w:r>
+      <w:r>
+        <w:t xml:space="preserve"> gestiune_clienti_sqlite.py</w:t>
       </w:r>
     </w:p>
     <w:sectPr>

</xml_diff>

<commit_message>
adaugare legenda culori abonamente
</commit_message>
<xml_diff>
--- a/pyinstaller command ok.docx
+++ b/pyinstaller command ok.docx
@@ -161,7 +161,10 @@
         <w:t>5</w:t>
       </w:r>
       <w:r>
-        <w:t>.1</w:t>
+        <w:t>.</w:t>
+      </w:r>
+      <w:r>
+        <w:t>2</w:t>
       </w:r>
       <w:r>
         <w:t xml:space="preserve"> gestiune_clienti_sqlite.py</w:t>

</xml_diff>